<commit_message>
updates to the main GUI + user manual
</commit_message>
<xml_diff>
--- a/MotionStim_UserManual.docx
+++ b/MotionStim_UserManual.docx
@@ -1,6 +1,6 @@
 
 <file path=word/document.xml><?xml version="1.0" encoding="utf-8"?>
-<w:document xmlns:wpc="http://schemas.microsoft.com/office/word/2010/wordprocessingCanvas" xmlns:cx="http://schemas.microsoft.com/office/drawing/2014/chartex" xmlns:cx1="http://schemas.microsoft.com/office/drawing/2015/9/8/chartex" xmlns:cx2="http://schemas.microsoft.com/office/drawing/2015/10/21/chartex" xmlns:cx3="http://schemas.microsoft.com/office/drawing/2016/5/9/chartex" xmlns:cx4="http://schemas.microsoft.com/office/drawing/2016/5/10/chartex" xmlns:cx5="http://schemas.microsoft.com/office/drawing/2016/5/11/chartex" xmlns:cx6="http://schemas.microsoft.com/office/drawing/2016/5/12/chartex" xmlns:cx7="http://schemas.microsoft.com/office/drawing/2016/5/13/chartex" xmlns:cx8="http://schemas.microsoft.com/office/drawing/2016/5/14/chartex" xmlns:mc="http://schemas.openxmlformats.org/markup-compatibility/2006" xmlns:aink="http://schemas.microsoft.com/office/drawing/2016/ink" xmlns:am3d="http://schemas.microsoft.com/office/drawing/2017/model3d" xmlns:o="urn:schemas-microsoft-com:office:office" xmlns:oel="http://schemas.microsoft.com/office/2019/extlst" xmlns:r="http://schemas.openxmlformats.org/officeDocument/2006/relationships" xmlns:m="http://schemas.openxmlformats.org/officeDocument/2006/math" xmlns:v="urn:schemas-microsoft-com:vml" xmlns:wp14="http://schemas.microsoft.com/office/word/2010/wordprocessingDrawing" xmlns:wp="http://schemas.openxmlformats.org/drawingml/2006/wordprocessingDrawing" xmlns:w10="urn:schemas-microsoft-com:office:word" xmlns:w="http://schemas.openxmlformats.org/wordprocessingml/2006/main" xmlns:w14="http://schemas.microsoft.com/office/word/2010/wordml" xmlns:w15="http://schemas.microsoft.com/office/word/2012/wordml" xmlns:w16cex="http://schemas.microsoft.com/office/word/2018/wordml/cex" xmlns:w16cid="http://schemas.microsoft.com/office/word/2016/wordml/cid" xmlns:w16="http://schemas.microsoft.com/office/word/2018/wordml" xmlns:w16du="http://schemas.microsoft.com/office/word/2023/wordml/word16du" xmlns:w16sdtdh="http://schemas.microsoft.com/office/word/2020/wordml/sdtdatahash" xmlns:w16sdtfl="http://schemas.microsoft.com/office/word/2024/wordml/sdtformatlock" xmlns:w16se="http://schemas.microsoft.com/office/word/2015/wordml/symex" xmlns:wpg="http://schemas.microsoft.com/office/word/2010/wordprocessingGroup" xmlns:wpi="http://schemas.microsoft.com/office/word/2010/wordprocessingInk" xmlns:wne="http://schemas.microsoft.com/office/word/2006/wordml" xmlns:wps="http://schemas.microsoft.com/office/word/2010/wordprocessingShape" mc:Ignorable="w14 w15 w16se w16cid w16 w16cex w16sdtdh w16sdtfl w16du wp14">
+<w:document xmlns:wpc="http://schemas.microsoft.com/office/word/2010/wordprocessingCanvas" xmlns:cx="http://schemas.microsoft.com/office/drawing/2014/chartex" xmlns:cx1="http://schemas.microsoft.com/office/drawing/2015/9/8/chartex" xmlns:cx2="http://schemas.microsoft.com/office/drawing/2015/10/21/chartex" xmlns:cx3="http://schemas.microsoft.com/office/drawing/2016/5/9/chartex" xmlns:cx4="http://schemas.microsoft.com/office/drawing/2016/5/10/chartex" xmlns:cx5="http://schemas.microsoft.com/office/drawing/2016/5/11/chartex" xmlns:cx6="http://schemas.microsoft.com/office/drawing/2016/5/12/chartex" xmlns:cx7="http://schemas.microsoft.com/office/drawing/2016/5/13/chartex" xmlns:cx8="http://schemas.microsoft.com/office/drawing/2016/5/14/chartex" xmlns:mc="http://schemas.openxmlformats.org/markup-compatibility/2006" xmlns:aink="http://schemas.microsoft.com/office/drawing/2016/ink" xmlns:am3d="http://schemas.microsoft.com/office/drawing/2017/model3d" xmlns:o="urn:schemas-microsoft-com:office:office" xmlns:r="http://schemas.openxmlformats.org/officeDocument/2006/relationships" xmlns:m="http://schemas.openxmlformats.org/officeDocument/2006/math" xmlns:v="urn:schemas-microsoft-com:vml" xmlns:wp14="http://schemas.microsoft.com/office/word/2010/wordprocessingDrawing" xmlns:wp="http://schemas.openxmlformats.org/drawingml/2006/wordprocessingDrawing" xmlns:w10="urn:schemas-microsoft-com:office:word" xmlns:w="http://schemas.openxmlformats.org/wordprocessingml/2006/main" xmlns:w14="http://schemas.microsoft.com/office/word/2010/wordml" xmlns:w15="http://schemas.microsoft.com/office/word/2012/wordml" xmlns:w16cid="http://schemas.microsoft.com/office/word/2016/wordml/cid" xmlns:w16se="http://schemas.microsoft.com/office/word/2015/wordml/symex" xmlns:wpg="http://schemas.microsoft.com/office/word/2010/wordprocessingGroup" xmlns:wpi="http://schemas.microsoft.com/office/word/2010/wordprocessingInk" xmlns:wne="http://schemas.microsoft.com/office/word/2006/wordml" xmlns:wps="http://schemas.microsoft.com/office/word/2010/wordprocessingShape" mc:Ignorable="w14 w15 w16se w16cid wp14">
   <w:body>
     <w:p>
       <w:pPr>
@@ -23,7 +23,7 @@
           <w:b/>
           <w:bCs/>
         </w:rPr>
-        <w:t>Tactile Motion Stimulus Set-up</w:t>
+        <w:t>Tactile Motion Stimulus Setup</w:t>
       </w:r>
       <w:r>
         <w:rPr>
@@ -45,7 +45,7 @@
           <w:b/>
           <w:bCs/>
         </w:rPr>
-        <w:t xml:space="preserve">Hardware Set-up </w:t>
+        <w:t>Hardware Setup</w:t>
       </w:r>
     </w:p>
     <w:p>
@@ -80,7 +80,76 @@
       </w:r>
       <w:proofErr w:type="spellEnd"/>
       <w:r>
-        <w:t xml:space="preserve"> wheel </w:t>
+        <w:t xml:space="preserve"> </w:t>
+      </w:r>
+      <w:r>
+        <w:t>stepper motor</w:t>
+      </w:r>
+      <w:r>
+        <w:t xml:space="preserve"> </w:t>
+      </w:r>
+    </w:p>
+    <w:p>
+      <w:pPr>
+        <w:pStyle w:val="ListParagraph"/>
+        <w:numPr>
+          <w:ilvl w:val="0"/>
+          <w:numId w:val="1"/>
+        </w:numPr>
+      </w:pPr>
+      <w:r>
+        <w:t xml:space="preserve">Position the stimulus so that stimulus wheel is hovering above the finger (&lt; 26 mm above the finger). Try to position the stimulus so that the </w:t>
+      </w:r>
+      <w:proofErr w:type="spellStart"/>
+      <w:r>
+        <w:t>Herkulex</w:t>
+      </w:r>
+      <w:proofErr w:type="spellEnd"/>
+      <w:r>
+        <w:t xml:space="preserve"> stepper motor is to the left or behind the stimulus wheel. </w:t>
+      </w:r>
+    </w:p>
+    <w:p>
+      <w:pPr>
+        <w:ind w:left="720"/>
+        <w:jc w:val="center"/>
+      </w:pPr>
+      <w:r>
+        <w:drawing>
+          <wp:inline distT="0" distB="0" distL="0" distR="0" wp14:anchorId="7D02B696" wp14:editId="6037818B">
+            <wp:extent cx="2096219" cy="2071892"/>
+            <wp:effectExtent l="0" t="0" r="0" b="5080"/>
+            <wp:docPr id="1" name="Picture 1"/>
+            <wp:cNvGraphicFramePr>
+              <a:graphicFrameLocks xmlns:a="http://schemas.openxmlformats.org/drawingml/2006/main" noChangeAspect="1"/>
+            </wp:cNvGraphicFramePr>
+            <a:graphic xmlns:a="http://schemas.openxmlformats.org/drawingml/2006/main">
+              <a:graphicData uri="http://schemas.openxmlformats.org/drawingml/2006/picture">
+                <pic:pic xmlns:pic="http://schemas.openxmlformats.org/drawingml/2006/picture">
+                  <pic:nvPicPr>
+                    <pic:cNvPr id="1" name=""/>
+                    <pic:cNvPicPr/>
+                  </pic:nvPicPr>
+                  <pic:blipFill>
+                    <a:blip r:embed="rId8"/>
+                    <a:stretch>
+                      <a:fillRect/>
+                    </a:stretch>
+                  </pic:blipFill>
+                  <pic:spPr>
+                    <a:xfrm>
+                      <a:off x="0" y="0"/>
+                      <a:ext cx="2120901" cy="2096287"/>
+                    </a:xfrm>
+                    <a:prstGeom prst="rect">
+                      <a:avLst/>
+                    </a:prstGeom>
+                  </pic:spPr>
+                </pic:pic>
+              </a:graphicData>
+            </a:graphic>
+          </wp:inline>
+        </w:drawing>
       </w:r>
     </w:p>
     <w:p>
@@ -95,7 +164,7 @@
           <w:b/>
           <w:bCs/>
         </w:rPr>
-        <w:t>Arduino Boards Software Set-up</w:t>
+        <w:t>Arduino Boards Software Setup</w:t>
       </w:r>
     </w:p>
     <w:p>
@@ -178,7 +247,14 @@
           <w:b/>
           <w:bCs/>
         </w:rPr>
-        <w:t>) Instructions</w:t>
+        <w:t xml:space="preserve">) </w:t>
+      </w:r>
+      <w:r>
+        <w:rPr>
+          <w:b/>
+          <w:bCs/>
+        </w:rPr>
+        <w:t>Start-up</w:t>
       </w:r>
     </w:p>
     <w:p>
@@ -229,10 +305,728 @@
       <w:pPr>
         <w:pStyle w:val="ListParagraph"/>
         <w:numPr>
+          <w:ilvl w:val="1"/>
+          <w:numId w:val="2"/>
+        </w:numPr>
+      </w:pPr>
+      <w:r>
+        <w:t>If they turn red, be sure that the COM ports are correct and that you uploaded the Arduino code before running the GUI</w:t>
+      </w:r>
+    </w:p>
+    <w:p>
+      <w:pPr>
+        <w:rPr>
+          <w:b/>
+        </w:rPr>
+      </w:pPr>
+      <w:r>
+        <w:rPr>
+          <w:b/>
+        </w:rPr>
+        <w:t>GUI – Linear Actuator Control</w:t>
+      </w:r>
+    </w:p>
+    <w:p>
+      <w:pPr>
+        <w:pStyle w:val="ListParagraph"/>
+        <w:numPr>
           <w:ilvl w:val="0"/>
-          <w:numId w:val="2"/>
-        </w:numPr>
-      </w:pPr>
+          <w:numId w:val="4"/>
+        </w:numPr>
+      </w:pPr>
+      <w:r>
+        <w:t xml:space="preserve">The </w:t>
+      </w:r>
+      <w:r>
+        <w:rPr>
+          <w:b/>
+        </w:rPr>
+        <w:t>Depth Slider</w:t>
+      </w:r>
+      <w:r>
+        <w:t xml:space="preserve"> shows the depth of the linear actuator </w:t>
+      </w:r>
+      <w:r>
+        <w:t xml:space="preserve">in PWM Pulses. 900 is fully retracted, while 2100 is fully extended. The max stroke length of the linear actuator is 26 mm. </w:t>
+      </w:r>
+    </w:p>
+    <w:p>
+      <w:pPr>
+        <w:pStyle w:val="ListParagraph"/>
+        <w:numPr>
+          <w:ilvl w:val="0"/>
+          <w:numId w:val="4"/>
+        </w:numPr>
+      </w:pPr>
+      <w:r>
+        <w:t xml:space="preserve">Use the </w:t>
+      </w:r>
+      <w:r>
+        <w:rPr>
+          <w:b/>
+        </w:rPr>
+        <w:t>Move Step</w:t>
+      </w:r>
+      <w:r>
+        <w:t xml:space="preserve"> spinner to set your step size (in mm</w:t>
+      </w:r>
+      <w:r>
+        <w:t>, increments of 0.25 mm</w:t>
+      </w:r>
+      <w:r>
+        <w:t>)</w:t>
+      </w:r>
+      <w:r>
+        <w:t xml:space="preserve">. </w:t>
+      </w:r>
+      <w:r>
+        <w:t xml:space="preserve"> </w:t>
+      </w:r>
+    </w:p>
+    <w:p>
+      <w:pPr>
+        <w:pStyle w:val="ListParagraph"/>
+        <w:numPr>
+          <w:ilvl w:val="0"/>
+          <w:numId w:val="4"/>
+        </w:numPr>
+      </w:pPr>
+      <w:r>
+        <w:t xml:space="preserve">Use the </w:t>
+      </w:r>
+      <w:r>
+        <w:rPr>
+          <w:b/>
+        </w:rPr>
+        <w:t>Move Up</w:t>
+      </w:r>
+      <w:r>
+        <w:t xml:space="preserve"> and </w:t>
+      </w:r>
+      <w:r>
+        <w:rPr>
+          <w:b/>
+        </w:rPr>
+        <w:t>Move Down</w:t>
+      </w:r>
+      <w:r>
+        <w:t xml:space="preserve"> buttons to move the linear actuator up/down so that the wheel is just touching the finger pad</w:t>
+      </w:r>
+      <w:r>
+        <w:t>.</w:t>
+      </w:r>
+    </w:p>
+    <w:p>
+      <w:pPr>
+        <w:pStyle w:val="ListParagraph"/>
+        <w:numPr>
+          <w:ilvl w:val="0"/>
+          <w:numId w:val="4"/>
+        </w:numPr>
+      </w:pPr>
+      <w:r>
+        <w:lastRenderedPageBreak/>
+        <w:t xml:space="preserve">Once the wheel is just touching the finger, press the </w:t>
+      </w:r>
+      <w:r>
+        <w:rPr>
+          <w:b/>
+        </w:rPr>
+        <w:t>Set Base</w:t>
+      </w:r>
+      <w:r>
+        <w:t xml:space="preserve"> button. This will set the Base position (No Stimulus position) and the Depth position (Stimulus </w:t>
+      </w:r>
+      <w:r>
+        <w:t>Indentation</w:t>
+      </w:r>
+      <w:r>
+        <w:t xml:space="preserve"> position</w:t>
+      </w:r>
+      <w:r>
+        <w:t xml:space="preserve">). </w:t>
+      </w:r>
+      <w:r>
+        <w:t xml:space="preserve">This will not move the linear actuator yet. </w:t>
+      </w:r>
+    </w:p>
+    <w:p>
+      <w:pPr>
+        <w:pStyle w:val="ListParagraph"/>
+        <w:numPr>
+          <w:ilvl w:val="1"/>
+          <w:numId w:val="4"/>
+        </w:numPr>
+      </w:pPr>
+      <w:r>
+        <w:t xml:space="preserve">Base position is </w:t>
+      </w:r>
+      <w:r>
+        <w:t>determined</w:t>
+      </w:r>
+      <w:r>
+        <w:t xml:space="preserve"> by the </w:t>
+      </w:r>
+      <w:r>
+        <w:rPr>
+          <w:b/>
+        </w:rPr>
+        <w:t>Base Amount</w:t>
+      </w:r>
+      <w:r>
+        <w:t xml:space="preserve"> spinner (in mm)</w:t>
+      </w:r>
+      <w:r>
+        <w:t>, which is the distance that the wheel will be above the finger when not providing the stimulus</w:t>
+      </w:r>
+    </w:p>
+    <w:p>
+      <w:pPr>
+        <w:pStyle w:val="ListParagraph"/>
+        <w:numPr>
+          <w:ilvl w:val="1"/>
+          <w:numId w:val="4"/>
+        </w:numPr>
+      </w:pPr>
+      <w:r>
+        <w:t xml:space="preserve">Depth position is </w:t>
+      </w:r>
+      <w:r>
+        <w:t>determined</w:t>
+      </w:r>
+      <w:r>
+        <w:t xml:space="preserve"> by the </w:t>
+      </w:r>
+      <w:r>
+        <w:rPr>
+          <w:b/>
+        </w:rPr>
+        <w:t>Depth Amount</w:t>
+      </w:r>
+      <w:r>
+        <w:t xml:space="preserve"> spinner (in mm), which is the amount of indentation to provide for the stimulus. The actual distance that the linear actuator will move when indenting the stimulus wheel</w:t>
+      </w:r>
+      <w:r>
+        <w:t xml:space="preserve"> during a trial</w:t>
+      </w:r>
+      <w:r>
+        <w:t xml:space="preserve"> will be Base Amount + Depth Amount</w:t>
+      </w:r>
+      <w:r>
+        <w:t xml:space="preserve">. </w:t>
+      </w:r>
+    </w:p>
+    <w:p>
+      <w:pPr>
+        <w:pStyle w:val="ListParagraph"/>
+        <w:numPr>
+          <w:ilvl w:val="1"/>
+          <w:numId w:val="4"/>
+        </w:numPr>
+      </w:pPr>
+      <w:r>
+        <w:t xml:space="preserve">The Base Amount and Base Amount + Depth Amount values are multiplied by 46 (# pulses to move 1 mm) in Lines 168-169 to set the Base and Depth positions. </w:t>
+      </w:r>
+    </w:p>
+    <w:p>
+      <w:pPr>
+        <w:pStyle w:val="ListParagraph"/>
+        <w:numPr>
+          <w:ilvl w:val="0"/>
+          <w:numId w:val="4"/>
+        </w:numPr>
+      </w:pPr>
+      <w:r>
+        <w:t xml:space="preserve">Press the </w:t>
+      </w:r>
+      <w:r>
+        <w:rPr>
+          <w:b/>
+        </w:rPr>
+        <w:t>To Base</w:t>
+      </w:r>
+      <w:r>
+        <w:t xml:space="preserve"> button to move the linear actuator to </w:t>
+      </w:r>
+      <w:r>
+        <w:t>its</w:t>
+      </w:r>
+      <w:r>
+        <w:t xml:space="preserve"> base position</w:t>
+      </w:r>
+      <w:r>
+        <w:t xml:space="preserve">. </w:t>
+      </w:r>
+    </w:p>
+    <w:p>
+      <w:pPr>
+        <w:pStyle w:val="ListParagraph"/>
+        <w:numPr>
+          <w:ilvl w:val="0"/>
+          <w:numId w:val="4"/>
+        </w:numPr>
+      </w:pPr>
+      <w:r>
+        <w:t xml:space="preserve">If you would like to test the level of indentation for the stimulus, you can press the </w:t>
+      </w:r>
+      <w:r>
+        <w:rPr>
+          <w:b/>
+        </w:rPr>
+        <w:t>To Depth</w:t>
+      </w:r>
+      <w:r>
+        <w:t xml:space="preserve"> button, which indents the wheel into the skin. </w:t>
+      </w:r>
+      <w:r>
+        <w:t xml:space="preserve">Just be sure to press the </w:t>
+      </w:r>
+      <w:r>
+        <w:rPr>
+          <w:b/>
+        </w:rPr>
+        <w:t>To Base</w:t>
+      </w:r>
+      <w:r>
+        <w:t xml:space="preserve"> button afterwards to move the stimulus back to the Base position. </w:t>
+      </w:r>
+    </w:p>
+    <w:p>
+      <w:pPr>
+        <w:pStyle w:val="ListParagraph"/>
+        <w:numPr>
+          <w:ilvl w:val="0"/>
+          <w:numId w:val="4"/>
+        </w:numPr>
+      </w:pPr>
+      <w:r>
+        <w:t xml:space="preserve">The </w:t>
+      </w:r>
+      <w:proofErr w:type="gramStart"/>
+      <w:r>
+        <w:rPr>
+          <w:b/>
+        </w:rPr>
+        <w:t>To</w:t>
+      </w:r>
+      <w:proofErr w:type="gramEnd"/>
+      <w:r>
+        <w:rPr>
+          <w:b/>
+        </w:rPr>
+        <w:t xml:space="preserve"> Home</w:t>
+      </w:r>
+      <w:r>
+        <w:t xml:space="preserve"> button </w:t>
+      </w:r>
+      <w:r>
+        <w:t xml:space="preserve">will fully retract the </w:t>
+      </w:r>
+      <w:r>
+        <w:t>linear actuator</w:t>
+      </w:r>
+      <w:r>
+        <w:t xml:space="preserve"> to </w:t>
+      </w:r>
+      <w:r>
+        <w:t xml:space="preserve">its home position (900 or depth of 0 mm). </w:t>
+      </w:r>
+    </w:p>
+    <w:p>
+      <w:pPr>
+        <w:rPr>
+          <w:b/>
+        </w:rPr>
+      </w:pPr>
+      <w:r>
+        <w:rPr>
+          <w:b/>
+        </w:rPr>
+        <w:t xml:space="preserve">GUI – Stepper Motor Control </w:t>
+      </w:r>
+    </w:p>
+    <w:p>
+      <w:pPr>
+        <w:pStyle w:val="ListParagraph"/>
+        <w:numPr>
+          <w:ilvl w:val="0"/>
+          <w:numId w:val="5"/>
+        </w:numPr>
+      </w:pPr>
+      <w:r>
+        <w:t xml:space="preserve">Use the </w:t>
+      </w:r>
+      <w:r>
+        <w:rPr>
+          <w:b/>
+        </w:rPr>
+        <w:t>Step Size</w:t>
+      </w:r>
+      <w:r>
+        <w:t xml:space="preserve"> spinner to set your step size (in degrees, increments of 0.225 degrees) for setting the angular position of the wheel.  </w:t>
+      </w:r>
+    </w:p>
+    <w:p>
+      <w:pPr>
+        <w:pStyle w:val="ListParagraph"/>
+        <w:numPr>
+          <w:ilvl w:val="0"/>
+          <w:numId w:val="5"/>
+        </w:numPr>
+      </w:pPr>
+      <w:r>
+        <w:t xml:space="preserve">Use the </w:t>
+      </w:r>
+      <w:r>
+        <w:rPr>
+          <w:b/>
+        </w:rPr>
+        <w:t>Rotate CCW</w:t>
+      </w:r>
+      <w:r>
+        <w:t xml:space="preserve"> and </w:t>
+      </w:r>
+      <w:r>
+        <w:rPr>
+          <w:b/>
+        </w:rPr>
+        <w:t>Rotate CW</w:t>
+      </w:r>
+      <w:r>
+        <w:t xml:space="preserve"> buttons to position the wheel so that it is in the 90-degree position (i.e., aligned with the length of the finger, see image above for reference). </w:t>
+      </w:r>
+    </w:p>
+    <w:p>
+      <w:pPr>
+        <w:pStyle w:val="ListParagraph"/>
+        <w:numPr>
+          <w:ilvl w:val="0"/>
+          <w:numId w:val="5"/>
+        </w:numPr>
+      </w:pPr>
+      <w:r>
+        <w:t xml:space="preserve">Press the </w:t>
+      </w:r>
+      <w:r>
+        <w:rPr>
+          <w:b/>
+        </w:rPr>
+        <w:t>Set 90 on Finger</w:t>
+      </w:r>
+      <w:r>
+        <w:t xml:space="preserve"> button to save this wheel position. Whenever this button is pressed, it will consider the current angle of the wheel as 90 degrees, which will serve as the reference point to determine the other angle positions of the stepper motor. </w:t>
+      </w:r>
+    </w:p>
+    <w:p>
+      <w:pPr>
+        <w:pStyle w:val="ListParagraph"/>
+        <w:numPr>
+          <w:ilvl w:val="0"/>
+          <w:numId w:val="5"/>
+        </w:numPr>
+      </w:pPr>
+      <w:r>
+        <w:t xml:space="preserve">You can use the </w:t>
+      </w:r>
+      <w:r>
+        <w:rPr>
+          <w:b/>
+        </w:rPr>
+        <w:t>Rotation knob</w:t>
+      </w:r>
+      <w:r>
+        <w:t xml:space="preserve"> to test all the other angles. </w:t>
+      </w:r>
+    </w:p>
+    <w:p>
+      <w:pPr>
+        <w:pStyle w:val="ListParagraph"/>
+        <w:numPr>
+          <w:ilvl w:val="1"/>
+          <w:numId w:val="5"/>
+        </w:numPr>
+        <w:rPr>
+          <w:color w:val="FF0000"/>
+        </w:rPr>
+      </w:pPr>
+      <w:r>
+        <w:rPr>
+          <w:color w:val="FF0000"/>
+        </w:rPr>
+        <w:t>I recommend clicking on the actual numbers along the knob rather than using the curso</w:t>
+      </w:r>
+      <w:r>
+        <w:rPr>
+          <w:color w:val="FF0000"/>
+        </w:rPr>
+        <w:t xml:space="preserve">r to drag the knob’s arrow to </w:t>
+      </w:r>
+      <w:r>
+        <w:rPr>
+          <w:color w:val="FF0000"/>
+        </w:rPr>
+        <w:t>your</w:t>
+      </w:r>
+      <w:r>
+        <w:rPr>
+          <w:color w:val="FF0000"/>
+        </w:rPr>
+        <w:t xml:space="preserve"> target angle. </w:t>
+      </w:r>
+    </w:p>
+    <w:p>
+      <w:pPr>
+        <w:pStyle w:val="ListParagraph"/>
+        <w:numPr>
+          <w:ilvl w:val="1"/>
+          <w:numId w:val="5"/>
+        </w:numPr>
+        <w:rPr>
+          <w:color w:val="FF0000"/>
+        </w:rPr>
+      </w:pPr>
+      <w:r>
+        <w:rPr>
+          <w:color w:val="FF0000"/>
+        </w:rPr>
+        <w:t xml:space="preserve">Wait a few seconds in between consecutive changes to the angle of the stepper motor to give Arduino some time to process the commands coming from MATLAB </w:t>
+      </w:r>
+    </w:p>
+    <w:p>
+      <w:pPr>
+        <w:rPr>
+          <w:b/>
+        </w:rPr>
+      </w:pPr>
+      <w:r>
+        <w:rPr>
+          <w:b/>
+        </w:rPr>
+        <w:t>GUI – Speed Motor Control</w:t>
+      </w:r>
+    </w:p>
+    <w:p>
+      <w:pPr>
+        <w:pStyle w:val="ListParagraph"/>
+        <w:numPr>
+          <w:ilvl w:val="0"/>
+          <w:numId w:val="6"/>
+        </w:numPr>
+      </w:pPr>
+      <w:r>
+        <w:t xml:space="preserve">Use the </w:t>
+      </w:r>
+      <w:r>
+        <w:rPr>
+          <w:b/>
+        </w:rPr>
+        <w:t>Speed</w:t>
+      </w:r>
+      <w:r>
+        <w:t xml:space="preserve"> spinner to change the speed of how fast the</w:t>
+      </w:r>
+      <w:r>
+        <w:t xml:space="preserve"> stimulus wheel spins. The value of the Speed spinner does not have physical units but represents a unitless internal command value to set the speed of the </w:t>
+      </w:r>
+      <w:proofErr w:type="spellStart"/>
+      <w:r>
+        <w:t>Herkulex</w:t>
+      </w:r>
+      <w:proofErr w:type="spellEnd"/>
+      <w:r>
+        <w:t xml:space="preserve"> stepper motor. The range of ‘speeds’ is 0 to 1023 (max speed = 1023 = 0.166s/60 degrees). </w:t>
+      </w:r>
+      <w:proofErr w:type="gramStart"/>
+      <w:r>
+        <w:t>So</w:t>
+      </w:r>
+      <w:proofErr w:type="gramEnd"/>
+      <w:r>
+        <w:t xml:space="preserve"> a Speed of 510 is about half speed.   </w:t>
+      </w:r>
+    </w:p>
+    <w:p>
+      <w:pPr>
+        <w:pStyle w:val="ListParagraph"/>
+        <w:numPr>
+          <w:ilvl w:val="0"/>
+          <w:numId w:val="6"/>
+        </w:numPr>
+      </w:pPr>
+      <w:r>
+        <w:t xml:space="preserve">Use the </w:t>
+      </w:r>
+      <w:r>
+        <w:rPr>
+          <w:b/>
+        </w:rPr>
+        <w:t>Test Speed</w:t>
+      </w:r>
+      <w:r>
+        <w:t xml:space="preserve"> button to test the stimulus wheel rotation.</w:t>
+      </w:r>
+      <w:r>
+        <w:t xml:space="preserve"> </w:t>
+      </w:r>
+      <w:r>
+        <w:t xml:space="preserve">Press </w:t>
+      </w:r>
+      <w:r>
+        <w:rPr>
+          <w:b/>
+        </w:rPr>
+        <w:t>STOP</w:t>
+      </w:r>
+      <w:r>
+        <w:t xml:space="preserve"> when you want to stop rotating the wheel.</w:t>
+      </w:r>
+    </w:p>
+    <w:p>
+      <w:pPr>
+        <w:pStyle w:val="ListParagraph"/>
+        <w:numPr>
+          <w:ilvl w:val="0"/>
+          <w:numId w:val="6"/>
+        </w:numPr>
+      </w:pPr>
+      <w:r>
+        <w:t xml:space="preserve">Press the </w:t>
+      </w:r>
+      <w:r>
+        <w:rPr>
+          <w:b/>
+          <w:highlight w:val="yellow"/>
+        </w:rPr>
+        <w:t>Test Trial</w:t>
+      </w:r>
+      <w:r>
+        <w:t xml:space="preserve"> button to provide a test trial. </w:t>
+      </w:r>
+    </w:p>
+    <w:p>
+      <w:pPr>
+        <w:pStyle w:val="ListParagraph"/>
+        <w:numPr>
+          <w:ilvl w:val="1"/>
+          <w:numId w:val="6"/>
+        </w:numPr>
+        <w:rPr>
+          <w:color w:val="FF0000"/>
+        </w:rPr>
+      </w:pPr>
+      <w:r>
+        <w:rPr>
+          <w:color w:val="FF0000"/>
+        </w:rPr>
+        <w:t xml:space="preserve">Make sure that the linear actuator is at </w:t>
+      </w:r>
+      <w:r>
+        <w:rPr>
+          <w:color w:val="FF0000"/>
+        </w:rPr>
+        <w:t>its</w:t>
+      </w:r>
+      <w:r>
+        <w:rPr>
+          <w:color w:val="FF0000"/>
+        </w:rPr>
+        <w:t xml:space="preserve"> Base Position before pressing </w:t>
+      </w:r>
+      <w:r>
+        <w:rPr>
+          <w:color w:val="FF0000"/>
+        </w:rPr>
+        <w:t>Test Trial</w:t>
+      </w:r>
+      <w:r>
+        <w:rPr>
+          <w:color w:val="FF0000"/>
+        </w:rPr>
+        <w:t xml:space="preserve">. </w:t>
+      </w:r>
+    </w:p>
+    <w:p>
+      <w:pPr>
+        <w:pStyle w:val="ListParagraph"/>
+        <w:numPr>
+          <w:ilvl w:val="1"/>
+          <w:numId w:val="6"/>
+        </w:numPr>
+      </w:pPr>
+      <w:r>
+        <w:t xml:space="preserve">This will provide a test trial which involves spinning the wheel at the speed set by the </w:t>
+      </w:r>
+      <w:r>
+        <w:rPr>
+          <w:b/>
+        </w:rPr>
+        <w:t>Speed</w:t>
+      </w:r>
+      <w:r>
+        <w:t xml:space="preserve"> spinner -&gt; indenting the stimulus into the skin for the duration set by the </w:t>
+      </w:r>
+      <w:r>
+        <w:rPr>
+          <w:b/>
+        </w:rPr>
+        <w:lastRenderedPageBreak/>
+        <w:t>Duration (sec)</w:t>
+      </w:r>
+      <w:r>
+        <w:t xml:space="preserve"> spinner</w:t>
+      </w:r>
+      <w:r>
+        <w:t xml:space="preserve"> at the angle set by the </w:t>
+      </w:r>
+      <w:r>
+        <w:rPr>
+          <w:b/>
+        </w:rPr>
+        <w:t>Rotation</w:t>
+      </w:r>
+      <w:r>
+        <w:t xml:space="preserve"> knob</w:t>
+      </w:r>
+      <w:r>
+        <w:t xml:space="preserve"> -&gt; raising the wheel back up to Base position -&gt; stopping the spinning of the wheel</w:t>
+      </w:r>
+    </w:p>
+    <w:p>
+      <w:pPr>
+        <w:pStyle w:val="ListParagraph"/>
+        <w:numPr>
+          <w:ilvl w:val="1"/>
+          <w:numId w:val="6"/>
+        </w:numPr>
+      </w:pPr>
+      <w:r>
+        <w:t xml:space="preserve">The </w:t>
+      </w:r>
+      <w:proofErr w:type="spellStart"/>
+      <w:r>
+        <w:rPr>
+          <w:b/>
+        </w:rPr>
+        <w:t>StimDelay</w:t>
+      </w:r>
+      <w:proofErr w:type="spellEnd"/>
+      <w:r>
+        <w:t xml:space="preserve"> spinner is the delay </w:t>
+      </w:r>
+      <w:r>
+        <w:t xml:space="preserve">(in seconds) </w:t>
+      </w:r>
+      <w:r>
+        <w:t xml:space="preserve">between starting the rotation of the wheel and </w:t>
+      </w:r>
+      <w:r>
+        <w:t xml:space="preserve">indenting the stimulus </w:t>
+      </w:r>
+    </w:p>
+    <w:p/>
+    <w:p>
+      <w:bookmarkStart w:id="0" w:name="_GoBack"/>
+      <w:bookmarkEnd w:id="0"/>
     </w:p>
     <w:sectPr>
       <w:pgSz w:w="12240" w:h="15840"/>
@@ -245,8 +1039,97 @@
 </file>
 
 <file path=word/numbering.xml><?xml version="1.0" encoding="utf-8"?>
-<w:numbering xmlns:wpc="http://schemas.microsoft.com/office/word/2010/wordprocessingCanvas" xmlns:cx="http://schemas.microsoft.com/office/drawing/2014/chartex" xmlns:cx1="http://schemas.microsoft.com/office/drawing/2015/9/8/chartex" xmlns:cx2="http://schemas.microsoft.com/office/drawing/2015/10/21/chartex" xmlns:cx3="http://schemas.microsoft.com/office/drawing/2016/5/9/chartex" xmlns:cx4="http://schemas.microsoft.com/office/drawing/2016/5/10/chartex" xmlns:cx5="http://schemas.microsoft.com/office/drawing/2016/5/11/chartex" xmlns:cx6="http://schemas.microsoft.com/office/drawing/2016/5/12/chartex" xmlns:cx7="http://schemas.microsoft.com/office/drawing/2016/5/13/chartex" xmlns:cx8="http://schemas.microsoft.com/office/drawing/2016/5/14/chartex" xmlns:mc="http://schemas.openxmlformats.org/markup-compatibility/2006" xmlns:aink="http://schemas.microsoft.com/office/drawing/2016/ink" xmlns:am3d="http://schemas.microsoft.com/office/drawing/2017/model3d" xmlns:o="urn:schemas-microsoft-com:office:office" xmlns:oel="http://schemas.microsoft.com/office/2019/extlst" xmlns:r="http://schemas.openxmlformats.org/officeDocument/2006/relationships" xmlns:m="http://schemas.openxmlformats.org/officeDocument/2006/math" xmlns:v="urn:schemas-microsoft-com:vml" xmlns:wp14="http://schemas.microsoft.com/office/word/2010/wordprocessingDrawing" xmlns:wp="http://schemas.openxmlformats.org/drawingml/2006/wordprocessingDrawing" xmlns:w10="urn:schemas-microsoft-com:office:word" xmlns:w="http://schemas.openxmlformats.org/wordprocessingml/2006/main" xmlns:w14="http://schemas.microsoft.com/office/word/2010/wordml" xmlns:w15="http://schemas.microsoft.com/office/word/2012/wordml" xmlns:w16cex="http://schemas.microsoft.com/office/word/2018/wordml/cex" xmlns:w16cid="http://schemas.microsoft.com/office/word/2016/wordml/cid" xmlns:w16="http://schemas.microsoft.com/office/word/2018/wordml" xmlns:w16du="http://schemas.microsoft.com/office/word/2023/wordml/word16du" xmlns:w16sdtdh="http://schemas.microsoft.com/office/word/2020/wordml/sdtdatahash" xmlns:w16sdtfl="http://schemas.microsoft.com/office/word/2024/wordml/sdtformatlock" xmlns:w16se="http://schemas.microsoft.com/office/word/2015/wordml/symex" xmlns:wpg="http://schemas.microsoft.com/office/word/2010/wordprocessingGroup" xmlns:wpi="http://schemas.microsoft.com/office/word/2010/wordprocessingInk" xmlns:wne="http://schemas.microsoft.com/office/word/2006/wordml" xmlns:wps="http://schemas.microsoft.com/office/word/2010/wordprocessingShape" mc:Ignorable="w14 w15 w16se w16cid w16 w16cex w16sdtdh w16sdtfl w16du wp14">
+<w:numbering xmlns:wpc="http://schemas.microsoft.com/office/word/2010/wordprocessingCanvas" xmlns:cx="http://schemas.microsoft.com/office/drawing/2014/chartex" xmlns:cx1="http://schemas.microsoft.com/office/drawing/2015/9/8/chartex" xmlns:cx2="http://schemas.microsoft.com/office/drawing/2015/10/21/chartex" xmlns:cx3="http://schemas.microsoft.com/office/drawing/2016/5/9/chartex" xmlns:cx4="http://schemas.microsoft.com/office/drawing/2016/5/10/chartex" xmlns:cx5="http://schemas.microsoft.com/office/drawing/2016/5/11/chartex" xmlns:cx6="http://schemas.microsoft.com/office/drawing/2016/5/12/chartex" xmlns:cx7="http://schemas.microsoft.com/office/drawing/2016/5/13/chartex" xmlns:cx8="http://schemas.microsoft.com/office/drawing/2016/5/14/chartex" xmlns:mc="http://schemas.openxmlformats.org/markup-compatibility/2006" xmlns:aink="http://schemas.microsoft.com/office/drawing/2016/ink" xmlns:am3d="http://schemas.microsoft.com/office/drawing/2017/model3d" xmlns:o="urn:schemas-microsoft-com:office:office" xmlns:r="http://schemas.openxmlformats.org/officeDocument/2006/relationships" xmlns:m="http://schemas.openxmlformats.org/officeDocument/2006/math" xmlns:v="urn:schemas-microsoft-com:vml" xmlns:wp14="http://schemas.microsoft.com/office/word/2010/wordprocessingDrawing" xmlns:wp="http://schemas.openxmlformats.org/drawingml/2006/wordprocessingDrawing" xmlns:w10="urn:schemas-microsoft-com:office:word" xmlns:w="http://schemas.openxmlformats.org/wordprocessingml/2006/main" xmlns:w14="http://schemas.microsoft.com/office/word/2010/wordml" xmlns:w15="http://schemas.microsoft.com/office/word/2012/wordml" xmlns:w16cid="http://schemas.microsoft.com/office/word/2016/wordml/cid" xmlns:w16se="http://schemas.microsoft.com/office/word/2015/wordml/symex" xmlns:wpg="http://schemas.microsoft.com/office/word/2010/wordprocessingGroup" xmlns:wpi="http://schemas.microsoft.com/office/word/2010/wordprocessingInk" xmlns:wne="http://schemas.microsoft.com/office/word/2006/wordml" xmlns:wps="http://schemas.microsoft.com/office/word/2010/wordprocessingShape" mc:Ignorable="w14 w15 w16se w16cid wp14">
   <w:abstractNum w:abstractNumId="0" w15:restartNumberingAfterBreak="0">
+    <w:nsid w:val="0FD93900"/>
+    <w:multiLevelType w:val="hybridMultilevel"/>
+    <w:tmpl w:val="CECCFF9E"/>
+    <w:lvl w:ilvl="0" w:tplc="0409000F">
+      <w:start w:val="1"/>
+      <w:numFmt w:val="decimal"/>
+      <w:lvlText w:val="%1."/>
+      <w:lvlJc w:val="left"/>
+      <w:pPr>
+        <w:ind w:left="720" w:hanging="360"/>
+      </w:pPr>
+      <w:rPr>
+        <w:rFonts w:hint="default"/>
+      </w:rPr>
+    </w:lvl>
+    <w:lvl w:ilvl="1" w:tplc="04090019">
+      <w:start w:val="1"/>
+      <w:numFmt w:val="lowerLetter"/>
+      <w:lvlText w:val="%2."/>
+      <w:lvlJc w:val="left"/>
+      <w:pPr>
+        <w:ind w:left="1440" w:hanging="360"/>
+      </w:pPr>
+    </w:lvl>
+    <w:lvl w:ilvl="2" w:tplc="0409001B" w:tentative="1">
+      <w:start w:val="1"/>
+      <w:numFmt w:val="lowerRoman"/>
+      <w:lvlText w:val="%3."/>
+      <w:lvlJc w:val="right"/>
+      <w:pPr>
+        <w:ind w:left="2160" w:hanging="180"/>
+      </w:pPr>
+    </w:lvl>
+    <w:lvl w:ilvl="3" w:tplc="0409000F" w:tentative="1">
+      <w:start w:val="1"/>
+      <w:numFmt w:val="decimal"/>
+      <w:lvlText w:val="%4."/>
+      <w:lvlJc w:val="left"/>
+      <w:pPr>
+        <w:ind w:left="2880" w:hanging="360"/>
+      </w:pPr>
+    </w:lvl>
+    <w:lvl w:ilvl="4" w:tplc="04090019" w:tentative="1">
+      <w:start w:val="1"/>
+      <w:numFmt w:val="lowerLetter"/>
+      <w:lvlText w:val="%5."/>
+      <w:lvlJc w:val="left"/>
+      <w:pPr>
+        <w:ind w:left="3600" w:hanging="360"/>
+      </w:pPr>
+    </w:lvl>
+    <w:lvl w:ilvl="5" w:tplc="0409001B" w:tentative="1">
+      <w:start w:val="1"/>
+      <w:numFmt w:val="lowerRoman"/>
+      <w:lvlText w:val="%6."/>
+      <w:lvlJc w:val="right"/>
+      <w:pPr>
+        <w:ind w:left="4320" w:hanging="180"/>
+      </w:pPr>
+    </w:lvl>
+    <w:lvl w:ilvl="6" w:tplc="0409000F" w:tentative="1">
+      <w:start w:val="1"/>
+      <w:numFmt w:val="decimal"/>
+      <w:lvlText w:val="%7."/>
+      <w:lvlJc w:val="left"/>
+      <w:pPr>
+        <w:ind w:left="5040" w:hanging="360"/>
+      </w:pPr>
+    </w:lvl>
+    <w:lvl w:ilvl="7" w:tplc="04090019" w:tentative="1">
+      <w:start w:val="1"/>
+      <w:numFmt w:val="lowerLetter"/>
+      <w:lvlText w:val="%8."/>
+      <w:lvlJc w:val="left"/>
+      <w:pPr>
+        <w:ind w:left="5760" w:hanging="360"/>
+      </w:pPr>
+    </w:lvl>
+    <w:lvl w:ilvl="8" w:tplc="0409001B" w:tentative="1">
+      <w:start w:val="1"/>
+      <w:numFmt w:val="lowerRoman"/>
+      <w:lvlText w:val="%9."/>
+      <w:lvlJc w:val="right"/>
+      <w:pPr>
+        <w:ind w:left="6480" w:hanging="180"/>
+      </w:pPr>
+    </w:lvl>
+  </w:abstractNum>
+  <w:abstractNum w:abstractNumId="1" w15:restartNumberingAfterBreak="0">
     <w:nsid w:val="19614F3F"/>
     <w:multiLevelType w:val="hybridMultilevel"/>
     <w:tmpl w:val="EC5ABB28"/>
@@ -335,7 +1218,96 @@
       </w:pPr>
     </w:lvl>
   </w:abstractNum>
-  <w:abstractNum w:abstractNumId="1" w15:restartNumberingAfterBreak="0">
+  <w:abstractNum w:abstractNumId="2" w15:restartNumberingAfterBreak="0">
+    <w:nsid w:val="1AB26765"/>
+    <w:multiLevelType w:val="hybridMultilevel"/>
+    <w:tmpl w:val="779ABE1E"/>
+    <w:lvl w:ilvl="0" w:tplc="0409000F">
+      <w:start w:val="1"/>
+      <w:numFmt w:val="decimal"/>
+      <w:lvlText w:val="%1."/>
+      <w:lvlJc w:val="left"/>
+      <w:pPr>
+        <w:ind w:left="720" w:hanging="360"/>
+      </w:pPr>
+      <w:rPr>
+        <w:rFonts w:hint="default"/>
+      </w:rPr>
+    </w:lvl>
+    <w:lvl w:ilvl="1" w:tplc="04090019">
+      <w:start w:val="1"/>
+      <w:numFmt w:val="lowerLetter"/>
+      <w:lvlText w:val="%2."/>
+      <w:lvlJc w:val="left"/>
+      <w:pPr>
+        <w:ind w:left="1440" w:hanging="360"/>
+      </w:pPr>
+    </w:lvl>
+    <w:lvl w:ilvl="2" w:tplc="0409001B" w:tentative="1">
+      <w:start w:val="1"/>
+      <w:numFmt w:val="lowerRoman"/>
+      <w:lvlText w:val="%3."/>
+      <w:lvlJc w:val="right"/>
+      <w:pPr>
+        <w:ind w:left="2160" w:hanging="180"/>
+      </w:pPr>
+    </w:lvl>
+    <w:lvl w:ilvl="3" w:tplc="0409000F" w:tentative="1">
+      <w:start w:val="1"/>
+      <w:numFmt w:val="decimal"/>
+      <w:lvlText w:val="%4."/>
+      <w:lvlJc w:val="left"/>
+      <w:pPr>
+        <w:ind w:left="2880" w:hanging="360"/>
+      </w:pPr>
+    </w:lvl>
+    <w:lvl w:ilvl="4" w:tplc="04090019" w:tentative="1">
+      <w:start w:val="1"/>
+      <w:numFmt w:val="lowerLetter"/>
+      <w:lvlText w:val="%5."/>
+      <w:lvlJc w:val="left"/>
+      <w:pPr>
+        <w:ind w:left="3600" w:hanging="360"/>
+      </w:pPr>
+    </w:lvl>
+    <w:lvl w:ilvl="5" w:tplc="0409001B" w:tentative="1">
+      <w:start w:val="1"/>
+      <w:numFmt w:val="lowerRoman"/>
+      <w:lvlText w:val="%6."/>
+      <w:lvlJc w:val="right"/>
+      <w:pPr>
+        <w:ind w:left="4320" w:hanging="180"/>
+      </w:pPr>
+    </w:lvl>
+    <w:lvl w:ilvl="6" w:tplc="0409000F" w:tentative="1">
+      <w:start w:val="1"/>
+      <w:numFmt w:val="decimal"/>
+      <w:lvlText w:val="%7."/>
+      <w:lvlJc w:val="left"/>
+      <w:pPr>
+        <w:ind w:left="5040" w:hanging="360"/>
+      </w:pPr>
+    </w:lvl>
+    <w:lvl w:ilvl="7" w:tplc="04090019" w:tentative="1">
+      <w:start w:val="1"/>
+      <w:numFmt w:val="lowerLetter"/>
+      <w:lvlText w:val="%8."/>
+      <w:lvlJc w:val="left"/>
+      <w:pPr>
+        <w:ind w:left="5760" w:hanging="360"/>
+      </w:pPr>
+    </w:lvl>
+    <w:lvl w:ilvl="8" w:tplc="0409001B" w:tentative="1">
+      <w:start w:val="1"/>
+      <w:numFmt w:val="lowerRoman"/>
+      <w:lvlText w:val="%9."/>
+      <w:lvlJc w:val="right"/>
+      <w:pPr>
+        <w:ind w:left="6480" w:hanging="180"/>
+      </w:pPr>
+    </w:lvl>
+  </w:abstractNum>
+  <w:abstractNum w:abstractNumId="3" w15:restartNumberingAfterBreak="0">
     <w:nsid w:val="2E285D9A"/>
     <w:multiLevelType w:val="hybridMultilevel"/>
     <w:tmpl w:val="AAFC24DE"/>
@@ -351,7 +1323,7 @@
         <w:rFonts w:hint="default"/>
       </w:rPr>
     </w:lvl>
-    <w:lvl w:ilvl="1" w:tplc="04090019" w:tentative="1">
+    <w:lvl w:ilvl="1" w:tplc="04090019">
       <w:start w:val="1"/>
       <w:numFmt w:val="lowerLetter"/>
       <w:lvlText w:val="%2."/>
@@ -424,7 +1396,7 @@
       </w:pPr>
     </w:lvl>
   </w:abstractNum>
-  <w:abstractNum w:abstractNumId="2" w15:restartNumberingAfterBreak="0">
+  <w:abstractNum w:abstractNumId="4" w15:restartNumberingAfterBreak="0">
     <w:nsid w:val="4CA92A19"/>
     <w:multiLevelType w:val="hybridMultilevel"/>
     <w:tmpl w:val="79704B90"/>
@@ -513,20 +1485,118 @@
       </w:pPr>
     </w:lvl>
   </w:abstractNum>
-  <w:num w:numId="1" w16cid:durableId="2103141639">
+  <w:abstractNum w:abstractNumId="5" w15:restartNumberingAfterBreak="0">
+    <w:nsid w:val="7DD82E31"/>
+    <w:multiLevelType w:val="hybridMultilevel"/>
+    <w:tmpl w:val="D7EE56DC"/>
+    <w:lvl w:ilvl="0" w:tplc="0409000F">
+      <w:start w:val="1"/>
+      <w:numFmt w:val="decimal"/>
+      <w:lvlText w:val="%1."/>
+      <w:lvlJc w:val="left"/>
+      <w:pPr>
+        <w:ind w:left="720" w:hanging="360"/>
+      </w:pPr>
+      <w:rPr>
+        <w:rFonts w:hint="default"/>
+      </w:rPr>
+    </w:lvl>
+    <w:lvl w:ilvl="1" w:tplc="04090019">
+      <w:start w:val="1"/>
+      <w:numFmt w:val="lowerLetter"/>
+      <w:lvlText w:val="%2."/>
+      <w:lvlJc w:val="left"/>
+      <w:pPr>
+        <w:ind w:left="1440" w:hanging="360"/>
+      </w:pPr>
+    </w:lvl>
+    <w:lvl w:ilvl="2" w:tplc="0409001B" w:tentative="1">
+      <w:start w:val="1"/>
+      <w:numFmt w:val="lowerRoman"/>
+      <w:lvlText w:val="%3."/>
+      <w:lvlJc w:val="right"/>
+      <w:pPr>
+        <w:ind w:left="2160" w:hanging="180"/>
+      </w:pPr>
+    </w:lvl>
+    <w:lvl w:ilvl="3" w:tplc="0409000F" w:tentative="1">
+      <w:start w:val="1"/>
+      <w:numFmt w:val="decimal"/>
+      <w:lvlText w:val="%4."/>
+      <w:lvlJc w:val="left"/>
+      <w:pPr>
+        <w:ind w:left="2880" w:hanging="360"/>
+      </w:pPr>
+    </w:lvl>
+    <w:lvl w:ilvl="4" w:tplc="04090019" w:tentative="1">
+      <w:start w:val="1"/>
+      <w:numFmt w:val="lowerLetter"/>
+      <w:lvlText w:val="%5."/>
+      <w:lvlJc w:val="left"/>
+      <w:pPr>
+        <w:ind w:left="3600" w:hanging="360"/>
+      </w:pPr>
+    </w:lvl>
+    <w:lvl w:ilvl="5" w:tplc="0409001B" w:tentative="1">
+      <w:start w:val="1"/>
+      <w:numFmt w:val="lowerRoman"/>
+      <w:lvlText w:val="%6."/>
+      <w:lvlJc w:val="right"/>
+      <w:pPr>
+        <w:ind w:left="4320" w:hanging="180"/>
+      </w:pPr>
+    </w:lvl>
+    <w:lvl w:ilvl="6" w:tplc="0409000F" w:tentative="1">
+      <w:start w:val="1"/>
+      <w:numFmt w:val="decimal"/>
+      <w:lvlText w:val="%7."/>
+      <w:lvlJc w:val="left"/>
+      <w:pPr>
+        <w:ind w:left="5040" w:hanging="360"/>
+      </w:pPr>
+    </w:lvl>
+    <w:lvl w:ilvl="7" w:tplc="04090019" w:tentative="1">
+      <w:start w:val="1"/>
+      <w:numFmt w:val="lowerLetter"/>
+      <w:lvlText w:val="%8."/>
+      <w:lvlJc w:val="left"/>
+      <w:pPr>
+        <w:ind w:left="5760" w:hanging="360"/>
+      </w:pPr>
+    </w:lvl>
+    <w:lvl w:ilvl="8" w:tplc="0409001B" w:tentative="1">
+      <w:start w:val="1"/>
+      <w:numFmt w:val="lowerRoman"/>
+      <w:lvlText w:val="%9."/>
+      <w:lvlJc w:val="right"/>
+      <w:pPr>
+        <w:ind w:left="6480" w:hanging="180"/>
+      </w:pPr>
+    </w:lvl>
+  </w:abstractNum>
+  <w:num w:numId="1">
+    <w:abstractNumId w:val="3"/>
+  </w:num>
+  <w:num w:numId="2">
     <w:abstractNumId w:val="1"/>
   </w:num>
-  <w:num w:numId="2" w16cid:durableId="1240215744">
+  <w:num w:numId="3">
+    <w:abstractNumId w:val="4"/>
+  </w:num>
+  <w:num w:numId="4">
+    <w:abstractNumId w:val="2"/>
+  </w:num>
+  <w:num w:numId="5">
+    <w:abstractNumId w:val="5"/>
+  </w:num>
+  <w:num w:numId="6">
     <w:abstractNumId w:val="0"/>
-  </w:num>
-  <w:num w:numId="3" w16cid:durableId="2056192407">
-    <w:abstractNumId w:val="2"/>
   </w:num>
 </w:numbering>
 </file>
 
 <file path=word/styles.xml><?xml version="1.0" encoding="utf-8"?>
-<w:styles xmlns:mc="http://schemas.openxmlformats.org/markup-compatibility/2006" xmlns:r="http://schemas.openxmlformats.org/officeDocument/2006/relationships" xmlns:w="http://schemas.openxmlformats.org/wordprocessingml/2006/main" xmlns:w14="http://schemas.microsoft.com/office/word/2010/wordml" xmlns:w15="http://schemas.microsoft.com/office/word/2012/wordml" xmlns:w16cex="http://schemas.microsoft.com/office/word/2018/wordml/cex" xmlns:w16cid="http://schemas.microsoft.com/office/word/2016/wordml/cid" xmlns:w16="http://schemas.microsoft.com/office/word/2018/wordml" xmlns:w16du="http://schemas.microsoft.com/office/word/2023/wordml/word16du" xmlns:w16sdtdh="http://schemas.microsoft.com/office/word/2020/wordml/sdtdatahash" xmlns:w16sdtfl="http://schemas.microsoft.com/office/word/2024/wordml/sdtformatlock" xmlns:w16se="http://schemas.microsoft.com/office/word/2015/wordml/symex" mc:Ignorable="w14 w15 w16se w16cid w16 w16cex w16sdtdh w16sdtfl w16du">
+<w:styles xmlns:mc="http://schemas.openxmlformats.org/markup-compatibility/2006" xmlns:r="http://schemas.openxmlformats.org/officeDocument/2006/relationships" xmlns:w="http://schemas.openxmlformats.org/wordprocessingml/2006/main" xmlns:w14="http://schemas.microsoft.com/office/word/2010/wordml" xmlns:w15="http://schemas.microsoft.com/office/word/2012/wordml" xmlns:w16cid="http://schemas.microsoft.com/office/word/2016/wordml/cid" xmlns:w16se="http://schemas.microsoft.com/office/word/2015/wordml/symex" mc:Ignorable="w14 w15 w16se w16cid">
   <w:docDefaults>
     <w:rPrDefault>
       <w:rPr>
@@ -542,7 +1612,7 @@
       </w:pPr>
     </w:pPrDefault>
   </w:docDefaults>
-  <w:latentStyles w:defLockedState="0" w:defUIPriority="99" w:defSemiHidden="0" w:defUnhideWhenUsed="0" w:defQFormat="0" w:count="376">
+  <w:latentStyles w:defLockedState="0" w:defUIPriority="99" w:defSemiHidden="0" w:defUnhideWhenUsed="0" w:defQFormat="0" w:count="375">
     <w:lsdException w:name="Normal" w:uiPriority="0" w:qFormat="1"/>
     <w:lsdException w:name="heading 1" w:uiPriority="9" w:qFormat="1"/>
     <w:lsdException w:name="heading 2" w:semiHidden="1" w:uiPriority="9" w:unhideWhenUsed="1" w:qFormat="1"/>
@@ -918,7 +1988,6 @@
     <w:lsdException w:name="Smart Hyperlink" w:semiHidden="1" w:unhideWhenUsed="1"/>
     <w:lsdException w:name="Hashtag" w:semiHidden="1" w:unhideWhenUsed="1"/>
     <w:lsdException w:name="Unresolved Mention" w:semiHidden="1" w:unhideWhenUsed="1"/>
-    <w:lsdException w:name="Smart Link" w:semiHidden="1" w:unhideWhenUsed="1"/>
   </w:latentStyles>
   <w:style w:type="paragraph" w:default="1" w:styleId="Normal">
     <w:name w:val="Normal"/>
@@ -1261,12 +2330,9 @@
 </file>
 
 <file path=customXml/item1.xml><?xml version="1.0" encoding="utf-8"?>
-<?mso-contentType ?>
-<FormTemplates xmlns="http://schemas.microsoft.com/sharepoint/v3/contenttype/forms">
-  <Display>DocumentLibraryForm</Display>
-  <Edit>DocumentLibraryForm</Edit>
-  <New>DocumentLibraryForm</New>
-</FormTemplates>
+<p:properties xmlns:p="http://schemas.microsoft.com/office/2006/metadata/properties" xmlns:xsi="http://www.w3.org/2001/XMLSchema-instance" xmlns:pc="http://schemas.microsoft.com/office/infopath/2007/PartnerControls">
+  <documentManagement/>
+</p:properties>
 </file>
 
 <file path=customXml/item2.xml><?xml version="1.0" encoding="utf-8"?>
@@ -1472,15 +2538,26 @@
 </file>
 
 <file path=customXml/item3.xml><?xml version="1.0" encoding="utf-8"?>
-<p:properties xmlns:p="http://schemas.microsoft.com/office/2006/metadata/properties" xmlns:xsi="http://www.w3.org/2001/XMLSchema-instance" xmlns:pc="http://schemas.microsoft.com/office/infopath/2007/PartnerControls">
-  <documentManagement/>
-</p:properties>
+<?mso-contentType ?>
+<FormTemplates xmlns="http://schemas.microsoft.com/sharepoint/v3/contenttype/forms">
+  <Display>DocumentLibraryForm</Display>
+  <Edit>DocumentLibraryForm</Edit>
+  <New>DocumentLibraryForm</New>
+</FormTemplates>
 </file>
 
 <file path=customXml/itemProps1.xml><?xml version="1.0" encoding="utf-8"?>
-<ds:datastoreItem xmlns:ds="http://schemas.openxmlformats.org/officeDocument/2006/customXml" ds:itemID="{ECCDB72D-ABC0-4FF2-AB93-57570E3C7765}">
+<ds:datastoreItem xmlns:ds="http://schemas.openxmlformats.org/officeDocument/2006/customXml" ds:itemID="{F609AF17-62DD-481F-A442-F069D62654A5}">
   <ds:schemaRefs>
-    <ds:schemaRef ds:uri="http://schemas.microsoft.com/sharepoint/v3/contenttype/forms"/>
+    <ds:schemaRef ds:uri="http://schemas.microsoft.com/office/2006/documentManagement/types"/>
+    <ds:schemaRef ds:uri="http://www.w3.org/XML/1998/namespace"/>
+    <ds:schemaRef ds:uri="http://purl.org/dc/dcmitype/"/>
+    <ds:schemaRef ds:uri="http://purl.org/dc/terms/"/>
+    <ds:schemaRef ds:uri="http://purl.org/dc/elements/1.1/"/>
+    <ds:schemaRef ds:uri="http://schemas.microsoft.com/office/infopath/2007/PartnerControls"/>
+    <ds:schemaRef ds:uri="http://schemas.openxmlformats.org/package/2006/metadata/core-properties"/>
+    <ds:schemaRef ds:uri="05a3b9a8-3f7f-4809-9eac-04097846866e"/>
+    <ds:schemaRef ds:uri="http://schemas.microsoft.com/office/2006/metadata/properties"/>
   </ds:schemaRefs>
 </ds:datastoreItem>
 </file>
@@ -1504,10 +2581,9 @@
 </file>
 
 <file path=customXml/itemProps3.xml><?xml version="1.0" encoding="utf-8"?>
-<ds:datastoreItem xmlns:ds="http://schemas.openxmlformats.org/officeDocument/2006/customXml" ds:itemID="{F609AF17-62DD-481F-A442-F069D62654A5}">
+<ds:datastoreItem xmlns:ds="http://schemas.openxmlformats.org/officeDocument/2006/customXml" ds:itemID="{ECCDB72D-ABC0-4FF2-AB93-57570E3C7765}">
   <ds:schemaRefs>
-    <ds:schemaRef ds:uri="http://schemas.microsoft.com/office/2006/metadata/properties"/>
-    <ds:schemaRef ds:uri="http://schemas.microsoft.com/office/infopath/2007/PartnerControls"/>
+    <ds:schemaRef ds:uri="http://schemas.microsoft.com/sharepoint/v3/contenttype/forms"/>
   </ds:schemaRefs>
 </ds:datastoreItem>
 </file>
</xml_diff>